<commit_message>
Clarify v14 architecture and bind release plots to measured results
</commit_message>
<xml_diff>
--- a/fssai-ra/paper/tbc-v14/TBC_v14_Developer_Security_Revision.docx
+++ b/fssai-ra/paper/tbc-v14/TBC_v14_Developer_Security_Revision.docx
@@ -743,7 +743,7 @@
         <w:drawing>
           <wp:inline>
             <wp:extent cx="5715000" cy="3077308"/>
-            <wp:docPr id="4" name="Picture 4"/>
+            <wp:docPr id="4" name="Picture 4" descr="Authority boundaries: agent proposals enter independent controls; monitor can restrict only; human approval and external isolation remain separate."/>
             <wp:cNvGraphicFramePr>
               <ns3:graphicFrameLocks noChangeAspect="1"/>
             </wp:cNvGraphicFramePr>
@@ -779,7 +779,7 @@
         <w:pStyle w:val="TBCCaption"/>
       </w:pPr>
       <w:r>
-        <w:t>Figure 4. Integration roadmap. The local SDK and Guardian are implemented; external framework adapters, institutional pilots and transport qualification remain future work.</w:t>
+        <w:t xml:space="preserve">Figure 4. Authority boundaries in v14. Untrusted reasoning proposes requests; the independent service mediates effects. AI monitoring may restrict authority. Host isolation, authenticated adapters and independent key custody remain deployment obligations.</w:t>
       </w:r>
     </w:p>
     <w:p>
@@ -866,7 +866,7 @@
         <w:drawing>
           <wp:inline>
             <wp:extent cx="5715000" cy="3166076"/>
-            <wp:docPr id="5" name="Picture 5"/>
+            <wp:docPr id="5" name="Picture 5" descr="Synthetic containment: unguarded 0 of 7, prompt plus allowlist 2 of 7, independent controls 7 of 7. Separate domain fixtures: 180 of 180 hostile contained and 58 of 58 benign completed."/>
             <wp:cNvGraphicFramePr>
               <ns3:graphicFrameLocks noChangeAspect="1"/>
             </wp:cNvGraphicFramePr>
@@ -902,7 +902,7 @@
         <w:pStyle w:val="TBCCaption"/>
       </w:pPr>
       <w:r>
-        <w:t>Figure 6. Falsifiable evaluation. The enforcement core remains fixed while the model slot is swapped; invariant failures expose residual dependence on model behaviour.</w:t>
+        <w:t xml:space="preserve">Figure 6. Recorded synthetic results. The three-arm comparison contains seven hostile and two benign proposals per arm. The separate six-profile experiment contains 180 hostile and 58 benign scenarios. These fixture counts do not estimate field attack rates, live-model accuracy or usability.</w:t>
       </w:r>
     </w:p>
     <w:p>

</xml_diff>